<commit_message>
Add editable LaTeX resume and correct research experience
</commit_message>
<xml_diff>
--- a/resumes/Hrudayangam-Mehta-Resume.docx
+++ b/resumes/Hrudayangam-Mehta-Resume.docx
@@ -169,6 +169,34 @@
     </w:p>
     <w:p>
       <w:pPr>
+        <w:spacing w:before="0" w:after="40"/>
+        <w:ind w:left="200" w:hanging="160"/>
+      </w:pPr>
+      <w:r>
+        <w:rPr/>
+        <w:t xml:space="preserve">• </w:t>
+      </w:r>
+      <w:r>
+        <w:rPr/>
+        <w:t>Co-authored From Woofs to Words: Towards Intelligent Robotic Guide Dogs with Verbal Communication (AAAI 2026; equal contribution), combining LLM dialogue, symbolic planning, and verbal explanations.</w:t>
+      </w:r>
+    </w:p>
+    <w:p>
+      <w:pPr>
+        <w:spacing w:before="0" w:after="40"/>
+        <w:ind w:left="200" w:hanging="160"/>
+      </w:pPr>
+      <w:r>
+        <w:rPr/>
+        <w:t xml:space="preserve">• </w:t>
+      </w:r>
+      <w:r>
+        <w:rPr/>
+        <w:t>Co-inventor of AI-Driven Floor Plan Understanding for Indoor/Outdoor Navigation, U.S. provisional patent application 63/884,317, filed September 18, 2025.</w:t>
+      </w:r>
+    </w:p>
+    <w:p>
+      <w:pPr>
         <w:keepNext/>
         <w:spacing w:before="60" w:after="40"/>
       </w:pPr>
@@ -195,7 +223,7 @@
         <w:rPr>
           <w:sz w:val="20"/>
         </w:rPr>
-        <w:t>Aug 2023 - TBD</w:t>
+        <w:t>Aug 2023 - May 2024</w:t>
       </w:r>
     </w:p>
     <w:p>
@@ -223,7 +251,7 @@
       </w:r>
       <w:r>
         <w:rPr/>
-        <w:t>Contributed to vision-language model research on floor-plan parsing and navigation action generation.</w:t>
+        <w:t>Co-authored Vision language models can parse floor plan maps (Robot Learning (ELSP), 2025; equal contribution), evaluating GPT-4o and Claude 3.5 Sonnet on floor-plan parsing and navigation action sequences.</w:t>
       </w:r>
     </w:p>
     <w:p>
@@ -270,15 +298,6 @@
     </w:p>
     <w:p>
       <w:pPr>
-        <w:spacing w:before="0"/>
-      </w:pPr>
-      <w:r>
-        <w:rPr/>
-        <w:t>Co-authored an evaluation of eight open-source LLMs on 11,315 annotated posts for policy-guided antisemitism detection.</w:t>
-      </w:r>
-    </w:p>
-    <w:p>
-      <w:pPr>
         <w:keepNext/>
         <w:spacing w:before="60" w:after="40"/>
       </w:pPr>
@@ -305,15 +324,6 @@
     </w:p>
     <w:p>
       <w:pPr>
-        <w:spacing w:before="0"/>
-      </w:pPr>
-      <w:r>
-        <w:rPr/>
-        <w:t>Equal contribution. Co-authored evaluations of GPT-4o and Claude 3.5 Sonnet on floor-plan parsing and navigation action sequences.</w:t>
-      </w:r>
-    </w:p>
-    <w:p>
-      <w:pPr>
         <w:keepNext/>
         <w:spacing w:before="60" w:after="40"/>
       </w:pPr>
@@ -336,54 +346,6 @@
           <w:sz w:val="20"/>
         </w:rPr>
         <w:t>AAAI 2026</w:t>
-      </w:r>
-    </w:p>
-    <w:p>
-      <w:pPr>
-        <w:spacing w:before="0"/>
-      </w:pPr>
-      <w:r>
-        <w:rPr/>
-        <w:t>Equal contribution. Co-authored research connecting LLM dialogue with symbolic task planning and plan/scene verbalization.</w:t>
-      </w:r>
-    </w:p>
-    <w:p>
-      <w:pPr>
-        <w:keepNext/>
-        <w:spacing w:before="160" w:after="100"/>
-        <w:pBdr>
-          <w:bottom w:val="single" w:sz="4" w:space="3" w:color="777777"/>
-        </w:pBdr>
-      </w:pPr>
-      <w:r>
-        <w:rPr>
-          <w:sz w:val="20"/>
-          <w:b/>
-        </w:rPr>
-        <w:t>PATENT APPLICATION</w:t>
-      </w:r>
-    </w:p>
-    <w:p>
-      <w:pPr>
-        <w:keepNext/>
-        <w:spacing w:before="60" w:after="40"/>
-      </w:pPr>
-      <w:hyperlink r:id="rId16">
-        <w:r>
-          <w:rPr>
-            <w:b/>
-          </w:rPr>
-          <w:t xml:space="preserve">AI-Driven Floor Plan Understanding for Indoor/Outdoor Navigation</w:t>
-        </w:r>
-      </w:hyperlink>
-    </w:p>
-    <w:p>
-      <w:pPr>
-        <w:spacing w:before="0"/>
-      </w:pPr>
-      <w:r>
-        <w:rPr/>
-        <w:t>Co-inventor. U.S. provisional patent application 63/884,317, filed September 18, 2025.</w:t>
       </w:r>
     </w:p>
     <w:p>

</xml_diff>

<commit_message>
Update current VLM research, role dates, and publication contributions
</commit_message>
<xml_diff>
--- a/resumes/Hrudayangam-Mehta-Resume.docx
+++ b/resumes/Hrudayangam-Mehta-Resume.docx
@@ -136,7 +136,7 @@
         <w:rPr>
           <w:sz w:val="20"/>
         </w:rPr>
-        <w:t>TBD - Present</w:t>
+        <w:t>May 2024 - Present</w:t>
       </w:r>
     </w:p>
     <w:p>
@@ -150,7 +150,7 @@
       </w:r>
       <w:r>
         <w:rPr/>
-        <w:t>Research AI applications in computational social science, preference optimization, and AI alignment.</w:t>
+        <w:t>Current research: vision-language model (VLM) alignment and preference optimization for AI applications in computational social science.</w:t>
       </w:r>
     </w:p>
     <w:p>
@@ -164,7 +164,21 @@
       </w:r>
       <w:r>
         <w:rPr/>
-        <w:t>Co-authored EMNLP 2025 research evaluating eight open-source LLMs on policy-guided classification and generated explanations.</w:t>
+        <w:t>Explore VLMs' capabilities for annotating social-media videos to support computational social science research (in progress).</w:t>
+      </w:r>
+    </w:p>
+    <w:p>
+      <w:pPr>
+        <w:spacing w:before="0" w:after="40"/>
+        <w:ind w:left="200" w:hanging="160"/>
+      </w:pPr>
+      <w:r>
+        <w:rPr/>
+        <w:t xml:space="preserve">• </w:t>
+      </w:r>
+      <w:r>
+        <w:rPr/>
+        <w:t>Co-authored Evaluating Large Language Models for Detecting Antisemitism (EMNLP 2025), evaluating eight open-source LLMs on policy-guided classification and generated explanations.</w:t>
       </w:r>
     </w:p>
     <w:p>
@@ -256,6 +270,20 @@
     </w:p>
     <w:p>
       <w:pPr>
+        <w:spacing w:before="0" w:after="40"/>
+        <w:ind w:left="200" w:hanging="160"/>
+      </w:pPr>
+      <w:r>
+        <w:rPr/>
+        <w:t xml:space="preserve">• </w:t>
+      </w:r>
+      <w:r>
+        <w:rPr/>
+        <w:t>Analyzed navigation failures across map size, task complexity, and label density in the floor-plan study.</w:t>
+      </w:r>
+    </w:p>
+    <w:p>
+      <w:pPr>
         <w:keepNext/>
         <w:spacing w:before="160" w:after="100"/>
         <w:pBdr>
@@ -298,6 +326,15 @@
     </w:p>
     <w:p>
       <w:pPr>
+        <w:spacing w:before="0"/>
+      </w:pPr>
+      <w:r>
+        <w:rPr/>
+        <w:t>Introduces Guided-CoT prompting for policy-guided antisemitism detection, improving classification performance across eight open-source LLMs.</w:t>
+      </w:r>
+    </w:p>
+    <w:p>
+      <w:pPr>
         <w:keepNext/>
         <w:spacing w:before="60" w:after="40"/>
       </w:pPr>
@@ -324,6 +361,15 @@
     </w:p>
     <w:p>
       <w:pPr>
+        <w:spacing w:before="0"/>
+      </w:pPr>
+      <w:r>
+        <w:rPr/>
+        <w:t>Develops a vision-language pipeline that converts floor-plan images and start-goal prompts into navigation action sequences, evaluating spatial reasoning across map sizes, task complexities, and label densities.</w:t>
+      </w:r>
+    </w:p>
+    <w:p>
+      <w:pPr>
         <w:keepNext/>
         <w:spacing w:before="60" w:after="40"/>
       </w:pPr>
@@ -346,6 +392,15 @@
           <w:sz w:val="20"/>
         </w:rPr>
         <w:t>AAAI 2026</w:t>
+      </w:r>
+    </w:p>
+    <w:p>
+      <w:pPr>
+        <w:spacing w:before="0"/>
+      </w:pPr>
+      <w:r>
+        <w:rPr/>
+        <w:t>Integrates LLM dialogue with symbolic task planning to clarify navigation requests and verbalize route plans and surrounding scenes for robotic guide dogs.</w:t>
       </w:r>
     </w:p>
     <w:p>

</xml_diff>